<commit_message>
fix: fixing curriculum vitae path
</commit_message>
<xml_diff>
--- a/src/assets/curriculum-vitae/CurriculumVitae - Pedro Miguel.docx
+++ b/src/assets/curriculum-vitae/CurriculumVitae - Pedro Miguel.docx
@@ -513,7 +513,7 @@
         <w:t>OBJETIVO</w:t>
       </w:r>
     </w:p>
-    <w:p xmlns:wp14="http://schemas.microsoft.com/office/word/2010/wordml" wp14:textId="360649BD">
+    <w:p xmlns:wp14="http://schemas.microsoft.com/office/word/2010/wordml" wp14:textId="6473F856">
       <w:pPr>
         <w:pStyle w:val="BodyText"/>
         <w:spacing w:before="28" w:after="0"/>
@@ -634,7 +634,7 @@
           <w:rFonts w:ascii="Arial" w:hAnsi="Arial"/>
           <w:spacing w:val="-2"/>
         </w:rPr>
-        <w:t xml:space="preserve">stack</w:t>
+        <w:t xml:space="preserve">end</w:t>
       </w:r>
     </w:p>
     <w:p xmlns:wp14="http://schemas.microsoft.com/office/word/2010/wordml" wp14:textId="77777777">

</xml_diff>